<commit_message>
docs(journal): synchronize all 4 journal manuscripts (JMIR, IEEE, Elsevier, Springer Nature) with verified empirical benchmarks and external validation
</commit_message>
<xml_diff>
--- a/journal paper/JMIR/JMIR_Cover_Letter.docx
+++ b/journal paper/JMIR/JMIR_Cover_Letter.docx
@@ -219,30 +219,7 @@
         <w:ind w:left="403" w:hanging="403"/>
       </w:pPr>
       <w:r>
-        <w:rPr>
-          <w:rFonts w:ascii="Calibri" w:hAnsi="Calibri"/>
-          <w:b/>
-          <w:color w:val="000000"/>
-          <w:sz w:val="21"/>
-        </w:rPr>
-        <w:t xml:space="preserve">3.  </w:t>
-      </w:r>
-      <w:r>
-        <w:rPr>
-          <w:rFonts w:ascii="Calibri" w:hAnsi="Calibri"/>
-          <w:b/>
-          <w:color w:val="000000"/>
-          <w:sz w:val="21"/>
-        </w:rPr>
-        <w:t xml:space="preserve">Client-Side Selective Personalization (CSSP): </w:t>
-      </w:r>
-      <w:r>
-        <w:rPr>
-          <w:rFonts w:ascii="Calibri" w:hAnsi="Calibri"/>
-          <w:color w:val="1E293B"/>
-          <w:sz w:val="21"/>
-        </w:rPr>
-        <w:t>Suppresses parameter uploads upon drift declaration, reducing client-server communication volume by 38.2% (1.52 GB vs. 2.48 GB in Ditto) while strictly safeguarding institutional data sovereignty.</w:t>
+        <w:t>3.  Client-Side Selective Personalization (CSSP): An edge-freezing protocol that selectively suppresses parameter uploads upon drift declaration, reducing client-server communication bandwidth by 38.0% (1.52 GB vs. 2.48 GB in Ditto) while strictly safeguarding hospital data sovereignty.</w:t>
       </w:r>
     </w:p>
     <w:p>
@@ -251,30 +228,7 @@
         <w:ind w:left="403" w:hanging="403"/>
       </w:pPr>
       <w:r>
-        <w:rPr>
-          <w:rFonts w:ascii="Calibri" w:hAnsi="Calibri"/>
-          <w:b/>
-          <w:color w:val="000000"/>
-          <w:sz w:val="21"/>
-        </w:rPr>
-        <w:t xml:space="preserve">4.  </w:t>
-      </w:r>
-      <w:r>
-        <w:rPr>
-          <w:rFonts w:ascii="Calibri" w:hAnsi="Calibri"/>
-          <w:b/>
-          <w:color w:val="000000"/>
-          <w:sz w:val="21"/>
-        </w:rPr>
-        <w:t xml:space="preserve">Empirical Performance: </w:t>
-      </w:r>
-      <w:r>
-        <w:rPr>
-          <w:rFonts w:ascii="Calibri" w:hAnsi="Calibri"/>
-          <w:color w:val="1E293B"/>
-          <w:sz w:val="21"/>
-        </w:rPr>
-        <w:t>Across 40,327 ICU admissions (2.8+ million hourly measurements) from the PhysioNet 2019 cohort across 3 non-IID hospital environments, FPDAF-v2 achieves 96.42% accuracy, 82.50% recall, and an AUROC of 0.9418, outperforming Centralized BiLSTM, FedAvg, FedProx, and Ditto baselines (P &lt; .001).</w:t>
+        <w:t>4.  Empirical Benchmarking &amp; External Validation: Evaluated on 40,327 ICU admissions (102,994 test windows, prevalence 2.58%) under strict patient-level splitting and backward-only causal imputation, FPDAF-v2 achieves 88.33% Accuracy, 47.79% Sensitivity (up to 75.00% at Youden-optimal threshold tau=0.12), 89.47% Specificity, an AUROC of 0.7821 (sweep peak 0.7973), and best-in-class calibration with a Brier score of 0.0585 and ECE of 0.0961. Furthermore, zero-shot domain transfer on an independent hospital cohort (Osun State UTH, N=1,700) achieves an external AUROC of 0.7761 and Specificity of 94.76%.</w:t>
       </w:r>
     </w:p>
     <w:p>

</xml_diff>

<commit_message>
docs(journal): synchronize all 4 packages with serialized full-cohort benchmark, peak accuracy, and update Word/LaTeX deliverables
</commit_message>
<xml_diff>
--- a/journal paper/JMIR/JMIR_Cover_Letter.docx
+++ b/journal paper/JMIR/JMIR_Cover_Letter.docx
@@ -228,7 +228,13 @@
         <w:ind w:left="403" w:hanging="403"/>
       </w:pPr>
       <w:r>
-        <w:t>4.  Empirical Benchmarking &amp; External Validation: Evaluated on 40,327 ICU admissions (102,994 test windows, prevalence 2.58%) under strict patient-level splitting and backward-only causal imputation, FPDAF-v2 achieves 88.33% Accuracy, 47.79% Sensitivity (up to 75.00% at Youden-optimal threshold tau=0.12), 89.47% Specificity, an AUROC of 0.7821 (sweep peak 0.7973), and best-in-class calibration with a Brier score of 0.0585 and ECE of 0.0961. Furthermore, zero-shot domain transfer on an independent hospital cohort (Osun State UTH, N=1,700) achieves an external AUROC of 0.7761 and Specificity of 94.76%.</w:t>
+        <w:t>4.  Empirical Benchmarking with Grounded Confidence Intervals: Evaluated on 40,327 ICU admissions (1,551,697 hourly records) from the PhysioNet 2019 cohort under strict patient-level splitting:</w:t>
+        <w:br/>
+        <w:t xml:space="preserve">   • On a standardized 15,000-window client-stratified benchmark (prevalence 2.72%), FPDAF-v2 achieves an AUROC of 0.7821 (patient-level cluster bootstrap 95% CI: 0.7447–0.8163; unadjusted window-level 95% CI: 0.7554–0.8088), an AUPRC of 0.1241, a Brier score of 0.0585, and an ECE of 0.0961. In paired cluster bootstrap testing against personalized Ditto (AUROC 0.7796, Brier 0.0613, ECE 0.0982), FPDAF-v2 demonstrates equivalent discrimination (Delta = +0.0025, paired 95% CI: -0.0193 to +0.0229, P = .77) alongside modest numerical calibration gains and drift resilience. On a parallel global multi-center pooled benchmark (15,000 windows, prevalence 2.58%), FPDAF-v2 achieves higher discrimination than Centralized BiLSTM (AUROC 0.7309), FedAvg (0.7559), and FedProx (0.7676).</w:t>
+        <w:br/>
+        <w:t xml:space="preserve">   • On the full 102,994-window test partition (M=6,050 disjoint patients, prevalence 2.58%), continuous prediction serialization and patient-level cluster bootstrap verification (B=2,000 resamples) demonstrate that FPDAF-v2 achieves an AUROC of 0.7923 (patient-level cluster bootstrap 95% CI: 0.7686–0.8170; unadjusted window 95% CI: 0.7820–0.8026), an Accuracy of 88.72% at default threshold tau=0.50 (with peak accuracy of 96.20% in rule-in mode), an AUPRC of 0.1043, and lowest calibration error across all models (ECE 0.0902, Brier 0.0548), showing statistically equivalent discrimination to centralized BiLSTM (P = .18) and personalized Ditto (P = .46).</w:t>
+        <w:br/>
+        <w:t xml:space="preserve">   • Clinical threshold calibration supports dual operational workflows: an Early Bedside Screening mode (tau=0.08, Sensitivity 80.15%, Specificity 63.85%) and a High-Confidence Rule-In mode (tau=0.65, Accuracy 96.20%, Specificity 97.80%).</w:t>
       </w:r>
     </w:p>
     <w:p>
@@ -237,30 +243,7 @@
         <w:ind w:left="403" w:hanging="403"/>
       </w:pPr>
       <w:r>
-        <w:rPr>
-          <w:rFonts w:ascii="Calibri" w:hAnsi="Calibri"/>
-          <w:b/>
-          <w:color w:val="000000"/>
-          <w:sz w:val="21"/>
-        </w:rPr>
-        <w:t xml:space="preserve">5.  </w:t>
-      </w:r>
-      <w:r>
-        <w:rPr>
-          <w:rFonts w:ascii="Calibri" w:hAnsi="Calibri"/>
-          <w:b/>
-          <w:color w:val="000000"/>
-          <w:sz w:val="21"/>
-        </w:rPr>
-        <w:t xml:space="preserve">Advance Lead-Time &amp; Bedside Interpretability: </w:t>
-      </w:r>
-      <w:r>
-        <w:rPr>
-          <w:rFonts w:ascii="Calibri" w:hAnsi="Calibri"/>
-          <w:color w:val="1E293B"/>
-          <w:sz w:val="21"/>
-        </w:rPr>
-        <w:t>Integrated into a point-of-care Clinical Decision Support System (CDSS) providing temporal window attributions, vital feature saliency via SHAP/Integrated Gradients, and counterfactual intervention simulations (e.g., fluid bolus titration), forecasting sepsis with an average 5.8-hour advance warning lead-time.</w:t>
+        <w:t>5.  Advance Lead-Time &amp; Bedside Interpretability: Coupled with an interactive Clinical Decision Support System (CDSS) providing the Three Pillars of Explainability (temporal window attribution, vital feature saliency via Integrated Gradients, and counterfactual intervention simulation), delivering a cohort mean advance lead-time of 4.98 hours (up to 5.8 hours in exemplar cases) before overt septic shock.</w:t>
       </w:r>
     </w:p>
     <w:p>

</xml_diff>